<commit_message>
Insert signature block field placeholders into 19 Common Paper DOCX templates
Add signatory field tags ({*_signatory_name}, {*_signatory_title_display},
{*_signatory_company_display}, {*_signatory_email}) into the signature
tables of each template's template.docx. Title and company cells use
_display variants driven by IF conditionals for entity/individual toggle.
</commit_message>
<xml_diff>
--- a/content/templates/common-paper-ai-addendum/template.docx
+++ b/content/templates/common-paper-ai-addendum/template.docx
@@ -2294,6 +2294,9 @@
                 <w:rtl w:val="0"/>
               </w:rPr>
             </w:r>
+            <w:r>
+              <w:t>{provider_signatory_name}</w:t>
+            </w:r>
           </w:p>
         </w:tc>
         <w:tc>
@@ -2349,6 +2352,9 @@
               <w:rPr>
                 <w:rtl w:val="0"/>
               </w:rPr>
+            </w:r>
+            <w:r>
+              <w:t>{customer_signatory_name}</w:t>
             </w:r>
           </w:p>
         </w:tc>
@@ -2417,6 +2423,9 @@
                 <w:rtl w:val="0"/>
               </w:rPr>
             </w:r>
+            <w:r>
+              <w:t>{provider_signatory_title_display}</w:t>
+            </w:r>
           </w:p>
         </w:tc>
         <w:tc>
@@ -2472,6 +2481,9 @@
               <w:rPr>
                 <w:rtl w:val="0"/>
               </w:rPr>
+            </w:r>
+            <w:r>
+              <w:t>{customer_signatory_title_display}</w:t>
             </w:r>
           </w:p>
         </w:tc>
@@ -2566,6 +2578,9 @@
                 <w:rtl w:val="0"/>
               </w:rPr>
             </w:r>
+            <w:r>
+              <w:t>{provider_signatory_email}</w:t>
+            </w:r>
           </w:p>
         </w:tc>
         <w:tc>
@@ -2621,6 +2636,9 @@
               <w:rPr>
                 <w:rtl w:val="0"/>
               </w:rPr>
+            </w:r>
+            <w:r>
+              <w:t>{customer_signatory_email}</w:t>
             </w:r>
           </w:p>
         </w:tc>

</xml_diff>